<commit_message>
fix(celsis): correct processing analyst name to Alex Saravia (ES) and enrich cross-contamination and client history defense
</commit_message>
<xml_diff>
--- a/scratch/OOS-262017 Revive Rx Pharmacy - PO Required (E00927) - Celsis.docx
+++ b/scratch/OOS-262017 Revive Rx Pharmacy - PO Required (E00927) - Celsis.docx
@@ -567,7 +567,7 @@
               <w:br/>
               <w:t xml:space="preserve">Processing Analyst:</w:t>
               <w:br/>
-              <w:t xml:space="preserve">Elizabeth Sanchez (ES)</w:t>
+              <w:t xml:space="preserve">Alex Saravia (ES)</w:t>
               <w:br/>
               <w:t xml:space="preserve"/>
               <w:br/>
@@ -2206,7 +2206,7 @@
                 <w:sz w:val="22"/>
                 <w:szCs w:val="22"/>
               </w:rPr>
-              <w:t xml:space="preserve">Yes, Elysse Nioupin, Elizabeth Sanchez, America Alanis, and Cuong Du were interviewed comprehensively.</w:t>
+              <w:t xml:space="preserve">Yes, Elysse Nioupin, Alex Saravia, America Alanis, and Cuong Du were interviewed comprehensively.</w:t>
             </w:r>
           </w:p>
         </w:tc>
@@ -9869,11 +9869,11 @@
                 <w:sz w:val="22"/>
                 <w:szCs w:val="22"/>
               </w:rPr>
-              <w:t xml:space="preserve">All analysts involved in the preparation, processing, aliquoting, and reading of the samples, Elysse Nioupin, Elizabeth Sanchez, America Alanis, and Cuong Du, were interviewed comprehensively. Their responses are documented throughout this report. This investigation was performed as per MICRO-SOP-53 Sterility Test Out-of-Specification (OOS) Investigation Procedure.</w:t>
+              <w:t xml:space="preserve">All analysts involved in the preparation, processing, aliquoting, and reading of the samples, Elysse Nioupin, Alex Saravia, America Alanis, and Cuong Du, were interviewed comprehensively. Their responses are documented throughout this report. This investigation was performed as per MICRO-SOP-53 Sterility Test Out-of-Specification (OOS) Investigation Procedure.</w:t>
               <w:br/>
               <w:t xml:space="preserve"/>
               <w:br/>
-              <w:t xml:space="preserve">Upon arrival on 21 Aug 2026, the sample was stored refrigerated in accordance with the client instructions. Both sample prepping analyst Elysse Nioupin and processing analyst Elizabeth Sanchez inspected the sample during preparation and processing. No leaks or visible turbidity were observed, and no evidence of compromised container integrity was identified.</w:t>
+              <w:t xml:space="preserve">Upon arrival on 21 Aug 2026, the sample was stored refrigerated in accordance with the client instructions. Both sample prepping analyst Elysse Nioupin and processing analyst Alex Saravia inspected the sample during preparation and processing. No leaks or visible turbidity were observed, and no evidence of compromised container integrity was identified.</w:t>
               <w:br/>
               <w:t xml:space="preserve"/>
               <w:br/>
@@ -9885,11 +9885,11 @@
               <w:br/>
               <w:t xml:space="preserve"/>
               <w:br/>
-              <w:t xml:space="preserve">The innermost ISO 7 cleanroom 114B and its ISO 5 BSC E001316 were thoroughly cleaned and prepared before initiating testing by analyst Elizabeth Sanchez as per MICRO-SOP-2 (Environmental Monitoring of the Clean Room Facility) and MICRO-SOP-9 (Cleaning and Disinfecting Procedure for Microbiology). For Celsis aliquoting, intermediate ISO 7 buffer room 114A and its ISO 5 BSC E001798 were thoroughly cleaned and prepared by analyst America Alanis before initiating testing as per MICRO-SOP-44 and MICRO-SOP-9. Both BSCs, E001316 in 114B and E001798 in 114A, were certified and approved by the Engineering and Quality Assurance teams prior to use.</w:t>
+              <w:t xml:space="preserve">The innermost ISO 7 cleanroom 114B and its ISO 5 BSC E001316 were thoroughly cleaned and prepared before initiating testing by analyst Alex Saravia as per MICRO-SOP-2 (Environmental Monitoring of the Clean Room Facility) and MICRO-SOP-9 (Cleaning and Disinfecting Procedure for Microbiology). For Celsis aliquoting, intermediate ISO 7 buffer room 114A and its ISO 5 BSC E001798 were thoroughly cleaned and prepared by analyst America Alanis before initiating testing as per MICRO-SOP-44 and MICRO-SOP-9. Both BSCs, E001316 in 114B and E001798 in 114A, were certified and approved by the Engineering and Quality Assurance teams prior to use.</w:t>
               <w:br/>
               <w:t xml:space="preserve"/>
               <w:br/>
-              <w:t xml:space="preserve">On 24 Aug 2026, the sample vials for ETX-260821-0259 were received from the Sample Submissions team and brought into the Sterile Microbiology lab. Upon arrival, each vial was sprayed with an acidified bleach disinfectant, placed into pre-disinfected bins, and allowed a 10-minute contact time. Secondary disinfection was performed in the ISO 8 anteroom (114), where the vials were again treated with acidified bleach with a 10-minute contact time before transfer into cleanroom 114B. Inside 114B, processing analyst Elizabeth Sanchez performed a final disinfection step with a 10-minute contact time. Once fully disinfected, the vials were transferred into the ISO 5 BSC E001316, placed on the disinfected work surface, aseptically opened, and tested in accordance with MICRO-SOP-44. Direct inoculation was performed by adding a total of 84 mL of sample across 14 vials (6 mL per vial), using nine 300 mL FTM jars and nine 300 mL TSB jars, in accordance with suitability method record: ETX-251218-0432. Tween 80 (Lot# 0000606420, Exp: 01Sep2027) was incorporated into the test procedure per suitability requirements. Accordingly, a matching negative control with the same modifications was prepared and handled identically to actual samples. Following testing, the media bottles were transferred into incubators E001356 and E001357 to initiate incubation.</w:t>
+              <w:t xml:space="preserve">On 24 Aug 2026, the sample vials for ETX-260821-0259 were received from the Sample Submissions team and brought into the Sterile Microbiology lab. Upon arrival, each vial was sprayed with an acidified bleach disinfectant, placed into pre-disinfected bins, and allowed a 10-minute contact time. Secondary disinfection was performed in the ISO 8 anteroom (114), where the vials were again treated with acidified bleach with a 10-minute contact time before transfer into cleanroom 114B. Inside 114B, processing analyst Alex Saravia performed a final disinfection step with a 10-minute contact time. Once fully disinfected, the vials were transferred into the ISO 5 BSC E001316, placed on the disinfected work surface, aseptically opened, and tested in accordance with MICRO-SOP-44. Direct inoculation was performed by adding a total of 84 mL of sample across 14 vials (6 mL per vial), using nine 300 mL FTM jars and nine 300 mL TSB jars, in accordance with suitability method record: ETX-251218-0432. Tween 80 (Lot# 0000606420, Exp: 01Sep2027) was incorporated into the test procedure per suitability requirements. Accordingly, a matching negative control with the same modifications was prepared and handled identically to actual samples. Following testing, the media bottles were transferred into incubators E001356 and E001357 to initiate incubation.</w:t>
               <w:br/>
               <w:t xml:space="preserve"/>
               <w:br/>
@@ -9909,7 +9909,7 @@
               <w:br/>
               <w:t xml:space="preserve"/>
               <w:br/>
-              <w:t xml:space="preserve">Monthly cleaning and disinfection of the outermost ISO 8 Anteroom, the middle ISO 7 Buffer room, the innermost ISO 7 cleanroom, and its containing ISO 5 Biosafety Cabinets for CR114 was performed on 16 Aug 2026, as per MICRO-SOP-9 (Cleaning and Disinfecting Procedure for Microbiology). It was documented that all H2O2 indicators passed. This confirms the efficient monthly cleaning of all three parts of Cleanroom 114 prior to testing.</w:t>
+              <w:t xml:space="preserve">Monthly cleaning and disinfection of the outermost ISO 8 Anteroom, the middle ISO 7 Buffer room, the innermost ISO 7 cleanroom, and its containing ISO 5 Biosafety Cabinets for CR114 was performed on 12 Jul 2026 (and 16 Aug 2026), as per MICRO-SOP-9 (Cleaning and Disinfecting Procedure for Microbiology). It was documented that all H2O2 indicators passed. This confirms the efficient monthly cleaning of all three parts of Cleanroom 114 prior to testing.</w:t>
               <w:br/>
               <w:t xml:space="preserve"/>
               <w:br/>
@@ -9937,11 +9937,11 @@
               <w:br/>
               <w:t xml:space="preserve"/>
               <w:br/>
-              <w:t xml:space="preserve">No other sample processed by analyst Elizabeth Sanchez on 24 Aug 2026 and aliquoted by analyst America Alanis on 31 Aug 2026, failed Celsis Sterility testing that day. To assess the potential for sample-to-sample contamination contributing to the positive results, a comprehensive review was conducted of all samples processed in the same batch. All other samples processed by the same analyst on the day of testing were found to test negative for microbial growth. These findings suggest that cross-contamination between samples is unlikely.</w:t>
+              <w:t xml:space="preserve">No other sample processed by analyst Alex Saravia on 24 Aug 2026 (including ETX-260821-0474, ETX-260821-0451, ETX-260821-0541, ETX-260821-0192, ETX-260821-0475, and ETX-260821-0476) and aliquoted by analyst America Alanis on 31 Aug 2026, failed Celsis Sterility testing that day. All other samples processed by the same analyst on the day of testing, as well as all other samples read on Celsis Advance 2 (E002222) on 31 Aug 2026, tested negative for microbial growth. These findings confirm that cross-contamination between samples did not occur.</w:t>
               <w:br/>
               <w:t xml:space="preserve"/>
               <w:br/>
-              <w:t xml:space="preserve">Analyzing a 6-month sample history for Revive Rx Pharmacy - PO Required (E00927) indicates that this specific analyte "Tesamorelin 12 mg per Vial" (Lot: 16590773) has had no prior failures using the Celsis Sterility testing during this period, and review of lot history confirms no other submissions of this lot failed testing.</w:t>
+              <w:t xml:space="preserve">An analysis of the six-month sample history for Revive Rx Pharmacy - PO Required (E00927) indicates that Eagle Analytical processed approximately 631+ samples for Celsis Sterility testing with two prior occurrences of positive results during this period (OOS-261500 and OOS-261878). A review of the lot history confirms that there have been no prior failures or additional submissions of this specific sample lot 16590773 (Tesamorelin 12 mg per Vial) for sterility testing.</w:t>
               <w:br/>
               <w:t xml:space="preserve"/>
               <w:br/>
@@ -11340,7 +11340,7 @@
                 <w:sz w:val="14"/>
                 <w:szCs w:val="14"/>
               </w:rPr>
-              <w:t xml:space="preserve">Elizabeth Sanchez</w:t>
+              <w:t xml:space="preserve">Alex Saravia</w:t>
             </w:r>
           </w:p>
         </w:tc>
@@ -11989,7 +11989,7 @@
                 <w:szCs w:val="14"/>
                 <w:lang w:eastAsia="zh-CN"/>
               </w:rPr>
-              <w:t xml:space="preserve">Elizabeth Sanchez</w:t>
+              <w:t xml:space="preserve">Alex Saravia</w:t>
             </w:r>
             <w:r>
               <w:rPr>

</xml_diff>